<commit_message>
Add attendance vs exam score visual to report
</commit_message>
<xml_diff>
--- a/Data_Driven_Process_Improvement_Report_Template.docx
+++ b/Data_Driven_Process_Improvement_Report_Template.docx
@@ -13,15 +13,7 @@
           <w:color w:val="1F4E79"/>
           <w:sz w:val="56"/>
         </w:rPr>
-        <w:t>SCHOOL EXAM ANALYTICS REPORT</w:t>
-      </w:r>
-      <w:r>
-        <w:rPr>
-          <w:b/>
-          <w:color w:val="1F4E79"/>
-          <w:sz w:val="56"/>
-        </w:rPr>
-        <w:t xml:space="preserve"> </w:t>
+        <w:t xml:space="preserve">SCHOOL EXAM ANALYTICS REPORT </w:t>
       </w:r>
     </w:p>
     <w:p>
@@ -89,10 +81,7 @@
           </w:tcPr>
           <w:p>
             <w:r>
-              <w:t>Stakeholders</w:t>
-            </w:r>
-            <w:r>
-              <w:t xml:space="preserve"> </w:t>
+              <w:t xml:space="preserve">Stakeholders </w:t>
             </w:r>
           </w:p>
         </w:tc>
@@ -384,15 +373,7 @@
                 <w:color w:val="1F4E79"/>
                 <w:sz w:val="17"/>
               </w:rPr>
-              <w:t xml:space="preserve">AVERAGE </w:t>
-            </w:r>
-            <w:r>
-              <w:rPr>
-                <w:b/>
-                <w:color w:val="1F4E79"/>
-                <w:sz w:val="17"/>
-              </w:rPr>
-              <w:t xml:space="preserve"> ATTENDANCE</w:t>
+              <w:t>AVERAGE  ATTENDANCE</w:t>
             </w:r>
             <w:proofErr w:type="gramEnd"/>
           </w:p>
@@ -470,15 +451,7 @@
                 <w:color w:val="373737"/>
                 <w:sz w:val="36"/>
               </w:rPr>
-              <w:t xml:space="preserve"> </w:t>
-            </w:r>
-            <w:r>
-              <w:rPr>
-                <w:b/>
-                <w:color w:val="373737"/>
-                <w:sz w:val="36"/>
-              </w:rPr>
-              <w:t>students</w:t>
+              <w:t xml:space="preserve"> students</w:t>
             </w:r>
           </w:p>
         </w:tc>
@@ -587,24 +560,40 @@
       </w:r>
     </w:p>
     <w:p>
-      <w:pPr>
-        <w:ind w:left="259"/>
-      </w:pPr>
-      <w:r>
-        <w:rPr>
-          <w:i/>
-          <w:color w:val="646464"/>
-          <w:sz w:val="18"/>
-        </w:rPr>
-        <w:t>Identify the specific process area(s) that deserve attention based on the data. Focus on variables that the organization can realistically influence.</w:t>
+      <w:r>
+        <w:t xml:space="preserve">The big focus point, we’re focusing on is attendance, as this is both </w:t>
+      </w:r>
+      <w:proofErr w:type="gramStart"/>
+      <w:r>
+        <w:t>a variable</w:t>
+      </w:r>
+      <w:proofErr w:type="gramEnd"/>
+      <w:r>
+        <w:t xml:space="preserve">, we can </w:t>
+      </w:r>
+      <w:proofErr w:type="gramStart"/>
+      <w:r>
+        <w:t>make an effort</w:t>
+      </w:r>
+      <w:proofErr w:type="gramEnd"/>
+      <w:r>
+        <w:t xml:space="preserve"> to enforce as the </w:t>
       </w:r>
     </w:p>
     <w:p>
       <w:pPr>
-        <w:pStyle w:val="TemplateLabel"/>
-      </w:pPr>
-      <w:r>
-        <w:t>PRIMARY FOCUS POINT</w:t>
+        <w:pStyle w:val="Heading1"/>
+      </w:pPr>
+      <w:r>
+        <w:t>4. Data Findings and Visual Evidence</w:t>
+      </w:r>
+    </w:p>
+    <w:p>
+      <w:pPr>
+        <w:pStyle w:val="Heading2"/>
+      </w:pPr>
+      <w:r>
+        <w:t>4.1 Attendance</w:t>
       </w:r>
     </w:p>
     <w:p>
@@ -613,15 +602,112 @@
           <w:i/>
           <w:color w:val="5F6368"/>
         </w:rPr>
-        <w:t>[Insert the main controllable factor or process area identified by the analysis]</w:t>
-      </w:r>
+        <w:t xml:space="preserve">Key question: </w:t>
+      </w:r>
+      <w:r>
+        <w:rPr>
+          <w:i/>
+          <w:color w:val="5F6368"/>
+        </w:rPr>
+        <w:t>Why do we care about attendance?</w:t>
+      </w:r>
+    </w:p>
+    <w:tbl>
+      <w:tblPr>
+        <w:tblW w:w="0" w:type="auto"/>
+        <w:jc w:val="center"/>
+        <w:tblLayout w:type="fixed"/>
+        <w:tblLook w:val="04A0" w:firstRow="1" w:lastRow="0" w:firstColumn="1" w:lastColumn="0" w:noHBand="0" w:noVBand="1"/>
+      </w:tblPr>
+      <w:tblGrid>
+        <w:gridCol w:w="9504"/>
+      </w:tblGrid>
+      <w:tr>
+        <w:trPr>
+          <w:jc w:val="center"/>
+        </w:trPr>
+        <w:tc>
+          <w:tcPr>
+            <w:tcW w:w="9504" w:type="dxa"/>
+            <w:shd w:val="clear" w:color="auto" w:fill="F4F6F8"/>
+            <w:tcMar>
+              <w:top w:w="250" w:type="dxa"/>
+              <w:left w:w="180" w:type="dxa"/>
+              <w:bottom w:w="250" w:type="dxa"/>
+              <w:right w:w="180" w:type="dxa"/>
+            </w:tcMar>
+          </w:tcPr>
+          <w:p>
+            <w:pPr>
+              <w:spacing w:after="0"/>
+            </w:pPr>
+          </w:p>
+          <w:p>
+            <w:pPr>
+              <w:spacing w:after="0"/>
+            </w:pPr>
+            <w:r>
+              <w:drawing>
+                <wp:inline distT="0" distB="0" distL="0" distR="0" wp14:anchorId="7AE405C5" wp14:editId="18BE404B">
+                  <wp:extent cx="5806440" cy="3938905"/>
+                  <wp:effectExtent l="0" t="0" r="3810" b="4445"/>
+                  <wp:docPr id="404686711" name="Picture 1"/>
+                  <wp:cNvGraphicFramePr>
+                    <a:graphicFrameLocks xmlns:a="http://schemas.openxmlformats.org/drawingml/2006/main" noChangeAspect="1"/>
+                  </wp:cNvGraphicFramePr>
+                  <a:graphic xmlns:a="http://schemas.openxmlformats.org/drawingml/2006/main">
+                    <a:graphicData uri="http://schemas.openxmlformats.org/drawingml/2006/picture">
+                      <pic:pic xmlns:pic="http://schemas.openxmlformats.org/drawingml/2006/picture">
+                        <pic:nvPicPr>
+                          <pic:cNvPr id="404686711" name=""/>
+                          <pic:cNvPicPr/>
+                        </pic:nvPicPr>
+                        <pic:blipFill>
+                          <a:blip r:embed="rId8"/>
+                          <a:stretch>
+                            <a:fillRect/>
+                          </a:stretch>
+                        </pic:blipFill>
+                        <pic:spPr>
+                          <a:xfrm>
+                            <a:off x="0" y="0"/>
+                            <a:ext cx="5806440" cy="3938905"/>
+                          </a:xfrm>
+                          <a:prstGeom prst="rect">
+                            <a:avLst/>
+                          </a:prstGeom>
+                        </pic:spPr>
+                      </pic:pic>
+                    </a:graphicData>
+                  </a:graphic>
+                </wp:inline>
+              </w:drawing>
+            </w:r>
+          </w:p>
+          <w:p>
+            <w:pPr>
+              <w:spacing w:after="0"/>
+            </w:pPr>
+          </w:p>
+          <w:p>
+            <w:pPr>
+              <w:jc w:val="center"/>
+            </w:pPr>
+          </w:p>
+        </w:tc>
+      </w:tr>
+    </w:tbl>
+    <w:p>
+      <w:pPr>
+        <w:spacing w:after="0"/>
+      </w:pPr>
     </w:p>
     <w:p>
       <w:pPr>
         <w:pStyle w:val="TemplateLabel"/>
       </w:pPr>
       <w:r>
-        <w:t>WHY IT MATTERS</w:t>
+        <w:t>TAKEAWAY</w:t>
       </w:r>
     </w:p>
     <w:p>
@@ -662,131 +748,10 @@
     </w:p>
     <w:p>
       <w:pPr>
-        <w:spacing w:after="40"/>
-      </w:pPr>
-      <w:r>
-        <w:rPr>
-          <w:color w:val="A5A5A5"/>
-          <w:sz w:val="18"/>
-        </w:rPr>
-        <w:t>________________________________________________________________________________</w:t>
-      </w:r>
-    </w:p>
-    <w:p>
-      <w:pPr>
-        <w:pStyle w:val="TemplateLabel"/>
-      </w:pPr>
-      <w:r>
-        <w:t>SUPPORTING METRIC(S)</w:t>
-      </w:r>
-    </w:p>
-    <w:p>
-      <w:pPr>
-        <w:spacing w:after="40"/>
-      </w:pPr>
-      <w:r>
-        <w:rPr>
-          <w:color w:val="A5A5A5"/>
-          <w:sz w:val="18"/>
-        </w:rPr>
-        <w:t>________________________________________________________________________________</w:t>
-      </w:r>
-    </w:p>
-    <w:p>
-      <w:pPr>
-        <w:spacing w:after="40"/>
-      </w:pPr>
-      <w:r>
-        <w:rPr>
-          <w:color w:val="A5A5A5"/>
-          <w:sz w:val="18"/>
-        </w:rPr>
-        <w:t>________________________________________________________________________________</w:t>
-      </w:r>
-    </w:p>
-    <w:p>
-      <w:pPr>
-        <w:spacing w:after="40"/>
-      </w:pPr>
-      <w:r>
-        <w:rPr>
-          <w:color w:val="A5A5A5"/>
-          <w:sz w:val="18"/>
-        </w:rPr>
-        <w:t>________________________________________________________________________________</w:t>
-      </w:r>
-    </w:p>
-    <w:p>
-      <w:pPr>
-        <w:pStyle w:val="TemplateLabel"/>
-      </w:pPr>
-      <w:r>
-        <w:t>SECONDARY FOCUS AREAS (OPTIONAL)</w:t>
-      </w:r>
-    </w:p>
-    <w:p>
-      <w:pPr>
-        <w:spacing w:after="40"/>
-      </w:pPr>
-      <w:r>
-        <w:rPr>
-          <w:color w:val="A5A5A5"/>
-          <w:sz w:val="18"/>
-        </w:rPr>
-        <w:t>________________________________________________________________________________</w:t>
-      </w:r>
-    </w:p>
-    <w:p>
-      <w:pPr>
-        <w:spacing w:after="40"/>
-      </w:pPr>
-      <w:r>
-        <w:rPr>
-          <w:color w:val="A5A5A5"/>
-          <w:sz w:val="18"/>
-        </w:rPr>
-        <w:t>________________________________________________________________________________</w:t>
-      </w:r>
-    </w:p>
-    <w:p>
-      <w:pPr>
-        <w:spacing w:after="40"/>
-      </w:pPr>
-      <w:r>
-        <w:rPr>
-          <w:color w:val="A5A5A5"/>
-          <w:sz w:val="18"/>
-        </w:rPr>
-        <w:t>________________________________________________________________________________</w:t>
-      </w:r>
-    </w:p>
-    <w:p>
-      <w:pPr>
-        <w:pStyle w:val="Heading1"/>
-      </w:pPr>
-      <w:r>
-        <w:t>4. Data Findings and Visual Evidence</w:t>
-      </w:r>
-    </w:p>
-    <w:p>
-      <w:pPr>
-        <w:ind w:left="259"/>
-      </w:pPr>
-      <w:r>
-        <w:rPr>
-          <w:i/>
-          <w:color w:val="646464"/>
-          <w:sz w:val="18"/>
-        </w:rPr>
-        <w:t>Use only the visuals that help explain the process-improvement story. Each visual should answer a specific question.</w:t>
-      </w:r>
-    </w:p>
-    <w:p>
-      <w:pPr>
         <w:pStyle w:val="Heading2"/>
       </w:pPr>
       <w:r>
-        <w:t>4.1 Attendance</w:t>
+        <w:t>4.2 Peer Influence</w:t>
       </w:r>
     </w:p>
     <w:p>
@@ -795,7 +760,7 @@
           <w:i/>
           <w:color w:val="5F6368"/>
         </w:rPr>
-        <w:t>Key question: [What does the data show about attendance and exam performance?]</w:t>
+        <w:t>Key question: [How do exam outcomes differ across peer-influence groups?]</w:t>
       </w:r>
     </w:p>
     <w:tbl>
@@ -833,151 +798,7 @@
                 <w:color w:val="464E58"/>
                 <w:sz w:val="22"/>
               </w:rPr>
-              <w:t>VISUAL 1 - Attendance and Exam Performance</w:t>
-            </w:r>
-          </w:p>
-          <w:p>
-            <w:pPr>
-              <w:spacing w:after="0"/>
-            </w:pPr>
-          </w:p>
-          <w:p>
-            <w:pPr>
-              <w:spacing w:after="0"/>
-            </w:pPr>
-          </w:p>
-          <w:p>
-            <w:pPr>
-              <w:spacing w:after="0"/>
-            </w:pPr>
-          </w:p>
-          <w:p>
-            <w:pPr>
-              <w:spacing w:after="0"/>
-            </w:pPr>
-          </w:p>
-          <w:p>
-            <w:pPr>
-              <w:spacing w:after="0"/>
-            </w:pPr>
-          </w:p>
-          <w:p>
-            <w:pPr>
-              <w:jc w:val="center"/>
-            </w:pPr>
-            <w:r>
-              <w:rPr>
-                <w:i/>
-                <w:color w:val="787878"/>
-                <w:sz w:val="16"/>
-              </w:rPr>
-              <w:t>[Paste chart/image exported from Python, Excel, or another visualization tool]</w:t>
-            </w:r>
-          </w:p>
-        </w:tc>
-      </w:tr>
-    </w:tbl>
-    <w:p>
-      <w:pPr>
-        <w:spacing w:after="0"/>
-      </w:pPr>
-    </w:p>
-    <w:p>
-      <w:pPr>
-        <w:pStyle w:val="TemplateLabel"/>
-      </w:pPr>
-      <w:r>
-        <w:t>TAKEAWAY</w:t>
-      </w:r>
-    </w:p>
-    <w:p>
-      <w:pPr>
-        <w:spacing w:after="40"/>
-      </w:pPr>
-      <w:r>
-        <w:rPr>
-          <w:color w:val="A5A5A5"/>
-          <w:sz w:val="18"/>
-        </w:rPr>
-        <w:t>________________________________________________________________________________</w:t>
-      </w:r>
-    </w:p>
-    <w:p>
-      <w:pPr>
-        <w:spacing w:after="40"/>
-      </w:pPr>
-      <w:r>
-        <w:rPr>
-          <w:color w:val="A5A5A5"/>
-          <w:sz w:val="18"/>
-        </w:rPr>
-        <w:t>________________________________________________________________________________</w:t>
-      </w:r>
-    </w:p>
-    <w:p>
-      <w:pPr>
-        <w:spacing w:after="40"/>
-      </w:pPr>
-      <w:r>
-        <w:rPr>
-          <w:color w:val="A5A5A5"/>
-          <w:sz w:val="18"/>
-        </w:rPr>
-        <w:t>________________________________________________________________________________</w:t>
-      </w:r>
-    </w:p>
-    <w:p>
-      <w:pPr>
-        <w:pStyle w:val="Heading2"/>
-      </w:pPr>
-      <w:r>
-        <w:t>4.2 Peer Influence</w:t>
-      </w:r>
-    </w:p>
-    <w:p>
-      <w:r>
-        <w:rPr>
-          <w:i/>
-          <w:color w:val="5F6368"/>
-        </w:rPr>
-        <w:t>Key question: [How do exam outcomes differ across peer-influence groups?]</w:t>
-      </w:r>
-    </w:p>
-    <w:tbl>
-      <w:tblPr>
-        <w:tblW w:w="0" w:type="auto"/>
-        <w:jc w:val="center"/>
-        <w:tblLayout w:type="fixed"/>
-        <w:tblLook w:val="04A0" w:firstRow="1" w:lastRow="0" w:firstColumn="1" w:lastColumn="0" w:noHBand="0" w:noVBand="1"/>
-      </w:tblPr>
-      <w:tblGrid>
-        <w:gridCol w:w="9504"/>
-      </w:tblGrid>
-      <w:tr>
-        <w:trPr>
-          <w:jc w:val="center"/>
-        </w:trPr>
-        <w:tc>
-          <w:tcPr>
-            <w:tcW w:w="9504" w:type="dxa"/>
-            <w:shd w:val="clear" w:color="auto" w:fill="F4F6F8"/>
-            <w:tcMar>
-              <w:top w:w="250" w:type="dxa"/>
-              <w:left w:w="180" w:type="dxa"/>
-              <w:bottom w:w="250" w:type="dxa"/>
-              <w:right w:w="180" w:type="dxa"/>
-            </w:tcMar>
-          </w:tcPr>
-          <w:p>
-            <w:pPr>
-              <w:jc w:val="center"/>
-            </w:pPr>
-            <w:r>
-              <w:rPr>
-                <w:b/>
-                <w:color w:val="464E58"/>
-                <w:sz w:val="22"/>
-              </w:rPr>
+              <w:lastRenderedPageBreak/>
               <w:t>VISUAL 2 - Peer Influence and Exam Performance</w:t>
             </w:r>
           </w:p>
@@ -1227,7 +1048,7 @@
       </w:pPr>
       <w:r>
         <w:lastRenderedPageBreak/>
-        <w:t>5. Three Evidence-Based Improvement Opportunities</w:t>
+        <w:t>5. Three Improvement Opportunities</w:t>
       </w:r>
     </w:p>
     <w:p>
@@ -2641,8 +2462,8 @@
     </w:tbl>
     <w:p/>
     <w:sectPr>
-      <w:headerReference w:type="default" r:id="rId8"/>
-      <w:footerReference w:type="default" r:id="rId9"/>
+      <w:headerReference w:type="default" r:id="rId9"/>
+      <w:footerReference w:type="default" r:id="rId10"/>
       <w:pgSz w:w="12240" w:h="15840"/>
       <w:pgMar w:top="1037" w:right="1152" w:bottom="1037" w:left="1152" w:header="720" w:footer="720" w:gutter="0"/>
       <w:cols w:space="720"/>

</xml_diff>

<commit_message>
Create the last two graphs needed for report
</commit_message>
<xml_diff>
--- a/Data_Driven_Process_Improvement_Report_Template.docx
+++ b/Data_Driven_Process_Improvement_Report_Template.docx
@@ -596,22 +596,7 @@
         <w:t>4.1 Attendance</w:t>
       </w:r>
     </w:p>
-    <w:p>
-      <w:r>
-        <w:rPr>
-          <w:i/>
-          <w:color w:val="5F6368"/>
-        </w:rPr>
-        <w:t xml:space="preserve">Key question: </w:t>
-      </w:r>
-      <w:r>
-        <w:rPr>
-          <w:i/>
-          <w:color w:val="5F6368"/>
-        </w:rPr>
-        <w:t>Why do we care about attendance?</w:t>
-      </w:r>
-    </w:p>
+    <w:p/>
     <w:tbl>
       <w:tblPr>
         <w:tblW w:w="0" w:type="auto"/>
@@ -647,6 +632,9 @@
               <w:spacing w:after="0"/>
             </w:pPr>
             <w:r>
+              <w:rPr>
+                <w:noProof/>
+              </w:rPr>
               <w:drawing>
                 <wp:inline distT="0" distB="0" distL="0" distR="0" wp14:anchorId="7AE405C5" wp14:editId="18BE404B">
                   <wp:extent cx="5806440" cy="3938905"/>
@@ -693,65 +681,40 @@
             <w:pPr>
               <w:jc w:val="center"/>
             </w:pPr>
+            <w:r>
+              <w:t xml:space="preserve">Attendance out of </w:t>
+            </w:r>
+            <w:proofErr w:type="gramStart"/>
+            <w:r>
+              <w:t>all of</w:t>
+            </w:r>
+            <w:proofErr w:type="gramEnd"/>
+            <w:r>
+              <w:t xml:space="preserve"> our survey factors has the largest correlation meaning, higher attendance = higher exam score = higher quality education. This could also signify that the exams are too strong, but as the graph shows, students are statically rewarded for </w:t>
+            </w:r>
+            <w:proofErr w:type="spellStart"/>
+            <w:proofErr w:type="gramStart"/>
+            <w:r>
+              <w:t>there</w:t>
+            </w:r>
+            <w:proofErr w:type="spellEnd"/>
+            <w:proofErr w:type="gramEnd"/>
+            <w:r>
+              <w:t xml:space="preserve"> attendance through the grade.</w:t>
+            </w:r>
           </w:p>
         </w:tc>
       </w:tr>
     </w:tbl>
     <w:p>
       <w:pPr>
-        <w:spacing w:after="0"/>
-      </w:pPr>
-    </w:p>
-    <w:p>
-      <w:pPr>
-        <w:pStyle w:val="TemplateLabel"/>
+        <w:pStyle w:val="Heading2"/>
       </w:pPr>
       <w:r>
-        <w:t>TAKEAWAY</w:t>
+        <w:t xml:space="preserve">4.2 </w:t>
       </w:r>
-    </w:p>
-    <w:p>
-      <w:pPr>
-        <w:spacing w:after="40"/>
-      </w:pPr>
       <w:r>
-        <w:rPr>
-          <w:color w:val="A5A5A5"/>
-          <w:sz w:val="18"/>
-        </w:rPr>
-        <w:t>________________________________________________________________________________</w:t>
-      </w:r>
-    </w:p>
-    <w:p>
-      <w:pPr>
-        <w:spacing w:after="40"/>
-      </w:pPr>
-      <w:r>
-        <w:rPr>
-          <w:color w:val="A5A5A5"/>
-          <w:sz w:val="18"/>
-        </w:rPr>
-        <w:t>________________________________________________________________________________</w:t>
-      </w:r>
-    </w:p>
-    <w:p>
-      <w:pPr>
-        <w:spacing w:after="40"/>
-      </w:pPr>
-      <w:r>
-        <w:rPr>
-          <w:color w:val="A5A5A5"/>
-          <w:sz w:val="18"/>
-        </w:rPr>
-        <w:t>________________________________________________________________________________</w:t>
-      </w:r>
-    </w:p>
-    <w:p>
-      <w:pPr>
-        <w:pStyle w:val="Heading2"/>
-      </w:pPr>
-      <w:r>
-        <w:t>4.2 Peer Influence</w:t>
+        <w:t>Studied Hours</w:t>
       </w:r>
     </w:p>
     <w:p>
@@ -798,14 +761,67 @@
                 <w:color w:val="464E58"/>
                 <w:sz w:val="22"/>
               </w:rPr>
-              <w:lastRenderedPageBreak/>
-              <w:t>VISUAL 2 - Peer Influence and Exam Performance</w:t>
+              <w:t>VISUAL 2 -</w:t>
+            </w:r>
+            <w:r>
+              <w:rPr>
+                <w:b/>
+                <w:color w:val="464E58"/>
+                <w:sz w:val="22"/>
+              </w:rPr>
+              <w:t xml:space="preserve"> Resources</w:t>
+            </w:r>
+            <w:r>
+              <w:rPr>
+                <w:b/>
+                <w:color w:val="464E58"/>
+                <w:sz w:val="22"/>
+              </w:rPr>
+              <w:t xml:space="preserve"> and Exam Performance</w:t>
             </w:r>
           </w:p>
           <w:p>
             <w:pPr>
               <w:spacing w:after="0"/>
             </w:pPr>
+            <w:r>
+              <w:lastRenderedPageBreak/>
+              <w:drawing>
+                <wp:inline distT="0" distB="0" distL="0" distR="0" wp14:anchorId="418C2AD9" wp14:editId="3954A804">
+                  <wp:extent cx="5806440" cy="3161030"/>
+                  <wp:effectExtent l="0" t="0" r="3810" b="1270"/>
+                  <wp:docPr id="832001009" name="Picture 1"/>
+                  <wp:cNvGraphicFramePr>
+                    <a:graphicFrameLocks xmlns:a="http://schemas.openxmlformats.org/drawingml/2006/main" noChangeAspect="1"/>
+                  </wp:cNvGraphicFramePr>
+                  <a:graphic xmlns:a="http://schemas.openxmlformats.org/drawingml/2006/main">
+                    <a:graphicData uri="http://schemas.openxmlformats.org/drawingml/2006/picture">
+                      <pic:pic xmlns:pic="http://schemas.openxmlformats.org/drawingml/2006/picture">
+                        <pic:nvPicPr>
+                          <pic:cNvPr id="832001009" name=""/>
+                          <pic:cNvPicPr/>
+                        </pic:nvPicPr>
+                        <pic:blipFill>
+                          <a:blip r:embed="rId9"/>
+                          <a:stretch>
+                            <a:fillRect/>
+                          </a:stretch>
+                        </pic:blipFill>
+                        <pic:spPr>
+                          <a:xfrm>
+                            <a:off x="0" y="0"/>
+                            <a:ext cx="5806440" cy="3161030"/>
+                          </a:xfrm>
+                          <a:prstGeom prst="rect">
+                            <a:avLst/>
+                          </a:prstGeom>
+                        </pic:spPr>
+                      </pic:pic>
+                    </a:graphicData>
+                  </a:graphic>
+                </wp:inline>
+              </w:drawing>
+            </w:r>
           </w:p>
           <w:p>
             <w:pPr>
@@ -845,70 +861,31 @@
     </w:tbl>
     <w:p>
       <w:pPr>
-        <w:spacing w:after="0"/>
-      </w:pPr>
-    </w:p>
-    <w:p>
-      <w:pPr>
-        <w:pStyle w:val="TemplateLabel"/>
-      </w:pPr>
+        <w:pStyle w:val="Heading2"/>
+      </w:pPr>
+      <w:proofErr w:type="gramStart"/>
       <w:r>
-        <w:t>TAKEAWAY</w:t>
+        <w:lastRenderedPageBreak/>
+        <w:t>4.3</w:t>
+      </w:r>
+      <w:r>
+        <w:t xml:space="preserve"> </w:t>
+      </w:r>
+      <w:r>
+        <w:t xml:space="preserve"> </w:t>
+      </w:r>
+      <w:r>
+        <w:t>Hours</w:t>
+      </w:r>
+      <w:proofErr w:type="gramEnd"/>
+      <w:r>
+        <w:t xml:space="preserve"> Studying </w:t>
+      </w:r>
+      <w:r>
+        <w:t>Variable</w:t>
       </w:r>
     </w:p>
-    <w:p>
-      <w:pPr>
-        <w:spacing w:after="40"/>
-      </w:pPr>
-      <w:r>
-        <w:rPr>
-          <w:color w:val="A5A5A5"/>
-          <w:sz w:val="18"/>
-        </w:rPr>
-        <w:t>________________________________________________________________________________</w:t>
-      </w:r>
-    </w:p>
-    <w:p>
-      <w:pPr>
-        <w:spacing w:after="40"/>
-      </w:pPr>
-      <w:r>
-        <w:rPr>
-          <w:color w:val="A5A5A5"/>
-          <w:sz w:val="18"/>
-        </w:rPr>
-        <w:t>________________________________________________________________________________</w:t>
-      </w:r>
-    </w:p>
-    <w:p>
-      <w:pPr>
-        <w:spacing w:after="40"/>
-      </w:pPr>
-      <w:r>
-        <w:rPr>
-          <w:color w:val="A5A5A5"/>
-          <w:sz w:val="18"/>
-        </w:rPr>
-        <w:t>________________________________________________________________________________</w:t>
-      </w:r>
-    </w:p>
-    <w:p>
-      <w:pPr>
-        <w:pStyle w:val="Heading2"/>
-      </w:pPr>
-      <w:r>
-        <w:t>4.3 Other Controllable Variable</w:t>
-      </w:r>
-    </w:p>
-    <w:p>
-      <w:r>
-        <w:rPr>
-          <w:i/>
-          <w:color w:val="5F6368"/>
-        </w:rPr>
-        <w:t>Variable: [Teacher quality / access to resources / tutoring / other controllable factor]</w:t>
-      </w:r>
-    </w:p>
+    <w:p/>
     <w:tbl>
       <w:tblPr>
         <w:tblW w:w="0" w:type="auto"/>
@@ -966,6 +943,44 @@
             <w:pPr>
               <w:spacing w:after="0"/>
             </w:pPr>
+            <w:r>
+              <w:lastRenderedPageBreak/>
+              <w:drawing>
+                <wp:inline distT="0" distB="0" distL="0" distR="0" wp14:anchorId="1B6AA7A6" wp14:editId="65AE44FF">
+                  <wp:extent cx="5806440" cy="3161030"/>
+                  <wp:effectExtent l="0" t="0" r="3810" b="1270"/>
+                  <wp:docPr id="1672664217" name="Picture 1"/>
+                  <wp:cNvGraphicFramePr>
+                    <a:graphicFrameLocks xmlns:a="http://schemas.openxmlformats.org/drawingml/2006/main" noChangeAspect="1"/>
+                  </wp:cNvGraphicFramePr>
+                  <a:graphic xmlns:a="http://schemas.openxmlformats.org/drawingml/2006/main">
+                    <a:graphicData uri="http://schemas.openxmlformats.org/drawingml/2006/picture">
+                      <pic:pic xmlns:pic="http://schemas.openxmlformats.org/drawingml/2006/picture">
+                        <pic:nvPicPr>
+                          <pic:cNvPr id="1672664217" name=""/>
+                          <pic:cNvPicPr/>
+                        </pic:nvPicPr>
+                        <pic:blipFill>
+                          <a:blip r:embed="rId9"/>
+                          <a:stretch>
+                            <a:fillRect/>
+                          </a:stretch>
+                        </pic:blipFill>
+                        <pic:spPr>
+                          <a:xfrm>
+                            <a:off x="0" y="0"/>
+                            <a:ext cx="5806440" cy="3161030"/>
+                          </a:xfrm>
+                          <a:prstGeom prst="rect">
+                            <a:avLst/>
+                          </a:prstGeom>
+                        </pic:spPr>
+                      </pic:pic>
+                    </a:graphicData>
+                  </a:graphic>
+                </wp:inline>
+              </w:drawing>
+            </w:r>
           </w:p>
           <w:p>
             <w:pPr>
@@ -1133,7 +1148,23 @@
           <w:color w:val="A5A5A5"/>
           <w:sz w:val="18"/>
         </w:rPr>
-        <w:t>________________________________________________________________________________</w:t>
+        <w:t>_______________</w:t>
+      </w:r>
+      <w:hyperlink r:id="rId10" w:history="1">
+        <w:r>
+          <w:rPr>
+            <w:rStyle w:val="Hyperlink"/>
+            <w:sz w:val="18"/>
+          </w:rPr>
+          <w:t>School Attendance Improvement Strategies - Child Welfare &amp; Attendance (CA Dept of Education)</w:t>
+        </w:r>
+      </w:hyperlink>
+      <w:r>
+        <w:rPr>
+          <w:color w:val="A5A5A5"/>
+          <w:sz w:val="18"/>
+        </w:rPr>
+        <w:t>_________________________________________________________________</w:t>
       </w:r>
     </w:p>
     <w:p>
@@ -1495,6 +1526,7 @@
         <w:pStyle w:val="Heading2"/>
       </w:pPr>
       <w:r>
+        <w:lastRenderedPageBreak/>
         <w:t>5.3 Improvement Opportunity 3: [Short Action Title]</w:t>
       </w:r>
     </w:p>
@@ -1515,7 +1547,6 @@
           <w:color w:val="A5A5A5"/>
           <w:sz w:val="18"/>
         </w:rPr>
-        <w:lastRenderedPageBreak/>
         <w:t>________________________________________________________________________________</w:t>
       </w:r>
     </w:p>
@@ -1710,19 +1741,6 @@
       </w:pPr>
       <w:r>
         <w:t>6. Methodology for Continuous Process Improvement</w:t>
-      </w:r>
-    </w:p>
-    <w:p>
-      <w:pPr>
-        <w:ind w:left="259"/>
-      </w:pPr>
-      <w:r>
-        <w:rPr>
-          <w:i/>
-          <w:color w:val="646464"/>
-          <w:sz w:val="18"/>
-        </w:rPr>
-        <w:t>Describe how the organization could turn this one-time analysis into a repeatable improvement process. Keep this high level; technical implementation details can remain in GitHub.</w:t>
       </w:r>
     </w:p>
     <w:p>
@@ -1835,372 +1853,9 @@
     </w:p>
     <w:p>
       <w:pPr>
-        <w:pStyle w:val="Heading2"/>
+        <w:pStyle w:val="Heading1"/>
       </w:pPr>
       <w:r>
-        <w:t>Process Measurement Plan</w:t>
-      </w:r>
-    </w:p>
-    <w:tbl>
-      <w:tblPr>
-        <w:tblW w:w="0" w:type="auto"/>
-        <w:jc w:val="center"/>
-        <w:tblLook w:val="04A0" w:firstRow="1" w:lastRow="0" w:firstColumn="1" w:lastColumn="0" w:noHBand="0" w:noVBand="1"/>
-      </w:tblPr>
-      <w:tblGrid>
-        <w:gridCol w:w="1987"/>
-        <w:gridCol w:w="1987"/>
-        <w:gridCol w:w="1987"/>
-        <w:gridCol w:w="1987"/>
-        <w:gridCol w:w="1987"/>
-      </w:tblGrid>
-      <w:tr>
-        <w:trPr>
-          <w:jc w:val="center"/>
-        </w:trPr>
-        <w:tc>
-          <w:tcPr>
-            <w:tcW w:w="1987" w:type="dxa"/>
-            <w:shd w:val="clear" w:color="auto" w:fill="D9EAF7"/>
-            <w:tcMar>
-              <w:top w:w="100" w:type="dxa"/>
-              <w:left w:w="80" w:type="dxa"/>
-              <w:bottom w:w="100" w:type="dxa"/>
-              <w:right w:w="80" w:type="dxa"/>
-            </w:tcMar>
-          </w:tcPr>
-          <w:p>
-            <w:pPr>
-              <w:jc w:val="center"/>
-            </w:pPr>
-            <w:r>
-              <w:rPr>
-                <w:b/>
-                <w:sz w:val="16"/>
-              </w:rPr>
-              <w:t>Metric</w:t>
-            </w:r>
-          </w:p>
-        </w:tc>
-        <w:tc>
-          <w:tcPr>
-            <w:tcW w:w="1987" w:type="dxa"/>
-            <w:shd w:val="clear" w:color="auto" w:fill="D9EAF7"/>
-            <w:tcMar>
-              <w:top w:w="100" w:type="dxa"/>
-              <w:left w:w="80" w:type="dxa"/>
-              <w:bottom w:w="100" w:type="dxa"/>
-              <w:right w:w="80" w:type="dxa"/>
-            </w:tcMar>
-          </w:tcPr>
-          <w:p>
-            <w:pPr>
-              <w:jc w:val="center"/>
-            </w:pPr>
-            <w:r>
-              <w:rPr>
-                <w:b/>
-                <w:sz w:val="16"/>
-              </w:rPr>
-              <w:t>Baseline</w:t>
-            </w:r>
-          </w:p>
-        </w:tc>
-        <w:tc>
-          <w:tcPr>
-            <w:tcW w:w="1987" w:type="dxa"/>
-            <w:shd w:val="clear" w:color="auto" w:fill="D9EAF7"/>
-            <w:tcMar>
-              <w:top w:w="100" w:type="dxa"/>
-              <w:left w:w="80" w:type="dxa"/>
-              <w:bottom w:w="100" w:type="dxa"/>
-              <w:right w:w="80" w:type="dxa"/>
-            </w:tcMar>
-          </w:tcPr>
-          <w:p>
-            <w:pPr>
-              <w:jc w:val="center"/>
-            </w:pPr>
-            <w:r>
-              <w:rPr>
-                <w:b/>
-                <w:sz w:val="16"/>
-              </w:rPr>
-              <w:t>Target</w:t>
-            </w:r>
-          </w:p>
-        </w:tc>
-        <w:tc>
-          <w:tcPr>
-            <w:tcW w:w="1987" w:type="dxa"/>
-            <w:shd w:val="clear" w:color="auto" w:fill="D9EAF7"/>
-            <w:tcMar>
-              <w:top w:w="100" w:type="dxa"/>
-              <w:left w:w="80" w:type="dxa"/>
-              <w:bottom w:w="100" w:type="dxa"/>
-              <w:right w:w="80" w:type="dxa"/>
-            </w:tcMar>
-          </w:tcPr>
-          <w:p>
-            <w:pPr>
-              <w:jc w:val="center"/>
-            </w:pPr>
-            <w:r>
-              <w:rPr>
-                <w:b/>
-                <w:sz w:val="16"/>
-              </w:rPr>
-              <w:t>Review Frequency</w:t>
-            </w:r>
-          </w:p>
-        </w:tc>
-        <w:tc>
-          <w:tcPr>
-            <w:tcW w:w="1987" w:type="dxa"/>
-            <w:shd w:val="clear" w:color="auto" w:fill="D9EAF7"/>
-            <w:tcMar>
-              <w:top w:w="100" w:type="dxa"/>
-              <w:left w:w="80" w:type="dxa"/>
-              <w:bottom w:w="100" w:type="dxa"/>
-              <w:right w:w="80" w:type="dxa"/>
-            </w:tcMar>
-          </w:tcPr>
-          <w:p>
-            <w:pPr>
-              <w:jc w:val="center"/>
-            </w:pPr>
-            <w:r>
-              <w:rPr>
-                <w:b/>
-                <w:sz w:val="16"/>
-              </w:rPr>
-              <w:t>Owner / Source</w:t>
-            </w:r>
-          </w:p>
-        </w:tc>
-      </w:tr>
-      <w:tr>
-        <w:trPr>
-          <w:jc w:val="center"/>
-        </w:trPr>
-        <w:tc>
-          <w:tcPr>
-            <w:tcW w:w="1987" w:type="dxa"/>
-            <w:tcMar>
-              <w:top w:w="130" w:type="dxa"/>
-              <w:left w:w="70" w:type="dxa"/>
-              <w:bottom w:w="130" w:type="dxa"/>
-              <w:right w:w="70" w:type="dxa"/>
-            </w:tcMar>
-          </w:tcPr>
-          <w:p>
-            <w:r>
-              <w:rPr>
-                <w:i/>
-                <w:color w:val="5F6368"/>
-              </w:rPr>
-              <w:t>[Fill in]</w:t>
-            </w:r>
-          </w:p>
-        </w:tc>
-        <w:tc>
-          <w:tcPr>
-            <w:tcW w:w="1987" w:type="dxa"/>
-            <w:tcMar>
-              <w:top w:w="130" w:type="dxa"/>
-              <w:left w:w="70" w:type="dxa"/>
-              <w:bottom w:w="130" w:type="dxa"/>
-              <w:right w:w="70" w:type="dxa"/>
-            </w:tcMar>
-          </w:tcPr>
-          <w:p>
-            <w:r>
-              <w:rPr>
-                <w:i/>
-                <w:color w:val="5F6368"/>
-              </w:rPr>
-              <w:t>[Fill in]</w:t>
-            </w:r>
-          </w:p>
-        </w:tc>
-        <w:tc>
-          <w:tcPr>
-            <w:tcW w:w="1987" w:type="dxa"/>
-            <w:tcMar>
-              <w:top w:w="130" w:type="dxa"/>
-              <w:left w:w="70" w:type="dxa"/>
-              <w:bottom w:w="130" w:type="dxa"/>
-              <w:right w:w="70" w:type="dxa"/>
-            </w:tcMar>
-          </w:tcPr>
-          <w:p>
-            <w:r>
-              <w:rPr>
-                <w:i/>
-                <w:color w:val="5F6368"/>
-              </w:rPr>
-              <w:t>[Fill in]</w:t>
-            </w:r>
-          </w:p>
-        </w:tc>
-        <w:tc>
-          <w:tcPr>
-            <w:tcW w:w="1987" w:type="dxa"/>
-            <w:tcMar>
-              <w:top w:w="130" w:type="dxa"/>
-              <w:left w:w="70" w:type="dxa"/>
-              <w:bottom w:w="130" w:type="dxa"/>
-              <w:right w:w="70" w:type="dxa"/>
-            </w:tcMar>
-          </w:tcPr>
-          <w:p>
-            <w:r>
-              <w:rPr>
-                <w:i/>
-                <w:color w:val="5F6368"/>
-              </w:rPr>
-              <w:t>[Fill in]</w:t>
-            </w:r>
-          </w:p>
-        </w:tc>
-        <w:tc>
-          <w:tcPr>
-            <w:tcW w:w="1987" w:type="dxa"/>
-            <w:tcMar>
-              <w:top w:w="130" w:type="dxa"/>
-              <w:left w:w="70" w:type="dxa"/>
-              <w:bottom w:w="130" w:type="dxa"/>
-              <w:right w:w="70" w:type="dxa"/>
-            </w:tcMar>
-          </w:tcPr>
-          <w:p>
-            <w:r>
-              <w:rPr>
-                <w:i/>
-                <w:color w:val="5F6368"/>
-              </w:rPr>
-              <w:t>[Fill in]</w:t>
-            </w:r>
-          </w:p>
-        </w:tc>
-      </w:tr>
-      <w:tr>
-        <w:trPr>
-          <w:jc w:val="center"/>
-        </w:trPr>
-        <w:tc>
-          <w:tcPr>
-            <w:tcW w:w="1987" w:type="dxa"/>
-            <w:tcMar>
-              <w:top w:w="130" w:type="dxa"/>
-              <w:left w:w="70" w:type="dxa"/>
-              <w:bottom w:w="130" w:type="dxa"/>
-              <w:right w:w="70" w:type="dxa"/>
-            </w:tcMar>
-          </w:tcPr>
-          <w:p>
-            <w:r>
-              <w:rPr>
-                <w:i/>
-                <w:color w:val="5F6368"/>
-              </w:rPr>
-              <w:t>[Fill in]</w:t>
-            </w:r>
-          </w:p>
-        </w:tc>
-        <w:tc>
-          <w:tcPr>
-            <w:tcW w:w="1987" w:type="dxa"/>
-            <w:tcMar>
-              <w:top w:w="130" w:type="dxa"/>
-              <w:left w:w="70" w:type="dxa"/>
-              <w:bottom w:w="130" w:type="dxa"/>
-              <w:right w:w="70" w:type="dxa"/>
-            </w:tcMar>
-          </w:tcPr>
-          <w:p>
-            <w:r>
-              <w:rPr>
-                <w:i/>
-                <w:color w:val="5F6368"/>
-              </w:rPr>
-              <w:t>[Fill in]</w:t>
-            </w:r>
-          </w:p>
-        </w:tc>
-        <w:tc>
-          <w:tcPr>
-            <w:tcW w:w="1987" w:type="dxa"/>
-            <w:tcMar>
-              <w:top w:w="130" w:type="dxa"/>
-              <w:left w:w="70" w:type="dxa"/>
-              <w:bottom w:w="130" w:type="dxa"/>
-              <w:right w:w="70" w:type="dxa"/>
-            </w:tcMar>
-          </w:tcPr>
-          <w:p>
-            <w:r>
-              <w:rPr>
-                <w:i/>
-                <w:color w:val="5F6368"/>
-              </w:rPr>
-              <w:t>[Fill in]</w:t>
-            </w:r>
-          </w:p>
-        </w:tc>
-        <w:tc>
-          <w:tcPr>
-            <w:tcW w:w="1987" w:type="dxa"/>
-            <w:tcMar>
-              <w:top w:w="130" w:type="dxa"/>
-              <w:left w:w="70" w:type="dxa"/>
-              <w:bottom w:w="130" w:type="dxa"/>
-              <w:right w:w="70" w:type="dxa"/>
-            </w:tcMar>
-          </w:tcPr>
-          <w:p>
-            <w:r>
-              <w:rPr>
-                <w:i/>
-                <w:color w:val="5F6368"/>
-              </w:rPr>
-              <w:t>[Fill in]</w:t>
-            </w:r>
-          </w:p>
-        </w:tc>
-        <w:tc>
-          <w:tcPr>
-            <w:tcW w:w="1987" w:type="dxa"/>
-            <w:tcMar>
-              <w:top w:w="130" w:type="dxa"/>
-              <w:left w:w="70" w:type="dxa"/>
-              <w:bottom w:w="130" w:type="dxa"/>
-              <w:right w:w="70" w:type="dxa"/>
-            </w:tcMar>
-          </w:tcPr>
-          <w:p>
-            <w:r>
-              <w:rPr>
-                <w:i/>
-                <w:color w:val="5F6368"/>
-              </w:rPr>
-              <w:t>[Fill in]</w:t>
-            </w:r>
-          </w:p>
-        </w:tc>
-      </w:tr>
-    </w:tbl>
-    <w:p>
-      <w:r>
-        <w:br w:type="page"/>
-      </w:r>
-    </w:p>
-    <w:p>
-      <w:pPr>
-        <w:pStyle w:val="Heading1"/>
-      </w:pPr>
-      <w:r>
-        <w:lastRenderedPageBreak/>
         <w:t>7. Closing Remarks</w:t>
       </w:r>
     </w:p>
@@ -2270,6 +1925,7 @@
           <w:color w:val="A5A5A5"/>
           <w:sz w:val="18"/>
         </w:rPr>
+        <w:lastRenderedPageBreak/>
         <w:t>________________________________________________________________________________</w:t>
       </w:r>
     </w:p>
@@ -2462,8 +2118,8 @@
     </w:tbl>
     <w:p/>
     <w:sectPr>
-      <w:headerReference w:type="default" r:id="rId9"/>
-      <w:footerReference w:type="default" r:id="rId10"/>
+      <w:headerReference w:type="default" r:id="rId11"/>
+      <w:footerReference w:type="default" r:id="rId12"/>
       <w:pgSz w:w="12240" w:h="15840"/>
       <w:pgMar w:top="1037" w:right="1152" w:bottom="1037" w:left="1152" w:header="720" w:footer="720" w:gutter="0"/>
       <w:cols w:space="720"/>

</xml_diff>